<commit_message>
update letter of intent
</commit_message>
<xml_diff>
--- a/LetterOfIntentAndPreviousWork.docx
+++ b/LetterOfIntentAndPreviousWork.docx
@@ -97,15 +97,6 @@
           <w:sz w:val="20"/>
           <w:szCs w:val="20"/>
         </w:rPr>
-        <w:t>2</w:t>
-      </w:r>
-      <w:r>
-        <w:rPr>
-          <w:rFonts w:cstheme="minorHAnsi"/>
-          <w:color w:val="000000"/>
-          <w:sz w:val="20"/>
-          <w:szCs w:val="20"/>
-        </w:rPr>
         <w:t>/</w:t>
       </w:r>
       <w:r>
@@ -115,7 +106,7 @@
           <w:sz w:val="20"/>
           <w:szCs w:val="20"/>
         </w:rPr>
-        <w:t>28</w:t>
+        <w:t>07</w:t>
       </w:r>
       <w:r>
         <w:rPr>
@@ -133,7 +124,7 @@
           <w:sz w:val="20"/>
           <w:szCs w:val="20"/>
         </w:rPr>
-        <w:t>5</w:t>
+        <w:t>6</w:t>
       </w:r>
     </w:p>
     <w:p>
@@ -340,6 +331,41 @@
           <w:szCs w:val="20"/>
         </w:rPr>
         <w:t xml:space="preserve"> their applicability in certain contexts relevant to Nike.</w:t>
+      </w:r>
+      <w:r>
+        <w:rPr>
+          <w:rFonts w:cstheme="minorHAnsi"/>
+          <w:color w:val="000000"/>
+          <w:sz w:val="20"/>
+          <w:szCs w:val="20"/>
+        </w:rPr>
+        <w:t xml:space="preserve"> Also </w:t>
+      </w:r>
+      <w:r>
+        <w:rPr>
+          <w:bCs/>
+          <w:sz w:val="20"/>
+          <w:szCs w:val="20"/>
+        </w:rPr>
+        <w:t xml:space="preserve">working on a framework for </w:t>
+      </w:r>
+      <w:r>
+        <w:rPr>
+          <w:rStyle w:val="s1"/>
+          <w:iCs/>
+          <w:sz w:val="20"/>
+          <w:szCs w:val="20"/>
+        </w:rPr>
+        <w:t>evaluation of these workflows using built-in MLflow judges, standard evaluation metrics, and custom-tailored scorers and custom metrics</w:t>
+      </w:r>
+      <w:r>
+        <w:rPr>
+          <w:rStyle w:val="s1"/>
+          <w:iCs/>
+          <w:sz w:val="20"/>
+          <w:szCs w:val="20"/>
+        </w:rPr>
+        <w:t>.</w:t>
       </w:r>
     </w:p>
     <w:p>
@@ -383,6 +409,7 @@
           <w:numId w:val="1"/>
         </w:numPr>
         <w:rPr>
+          <w:rStyle w:val="s1"/>
           <w:bCs/>
           <w:sz w:val="20"/>
           <w:szCs w:val="20"/>
@@ -472,6 +499,113 @@
       <w:r>
         <w:rPr>
           <w:bCs/>
+          <w:sz w:val="20"/>
+          <w:szCs w:val="20"/>
+        </w:rPr>
+        <w:t>;</w:t>
+      </w:r>
+      <w:r>
+        <w:rPr>
+          <w:bCs/>
+          <w:sz w:val="20"/>
+          <w:szCs w:val="20"/>
+        </w:rPr>
+        <w:t xml:space="preserve"> </w:t>
+      </w:r>
+      <w:r>
+        <w:rPr>
+          <w:bCs/>
+          <w:sz w:val="20"/>
+          <w:szCs w:val="20"/>
+        </w:rPr>
+        <w:t>a</w:t>
+      </w:r>
+      <w:r>
+        <w:rPr>
+          <w:bCs/>
+          <w:sz w:val="20"/>
+          <w:szCs w:val="20"/>
+        </w:rPr>
+        <w:t xml:space="preserve"> framework for </w:t>
+      </w:r>
+      <w:r>
+        <w:rPr>
+          <w:rStyle w:val="s1"/>
+          <w:iCs/>
+          <w:sz w:val="20"/>
+          <w:szCs w:val="20"/>
+        </w:rPr>
+        <w:t>e</w:t>
+      </w:r>
+      <w:r>
+        <w:rPr>
+          <w:rStyle w:val="s1"/>
+          <w:iCs/>
+          <w:sz w:val="20"/>
+          <w:szCs w:val="20"/>
+        </w:rPr>
+        <w:t xml:space="preserve">valuation of </w:t>
+      </w:r>
+      <w:r>
+        <w:rPr>
+          <w:rStyle w:val="s1"/>
+          <w:iCs/>
+          <w:sz w:val="20"/>
+          <w:szCs w:val="20"/>
+        </w:rPr>
+        <w:t>these</w:t>
+      </w:r>
+      <w:r>
+        <w:rPr>
+          <w:rStyle w:val="s1"/>
+          <w:iCs/>
+          <w:sz w:val="20"/>
+          <w:szCs w:val="20"/>
+        </w:rPr>
+        <w:t xml:space="preserve"> workflows </w:t>
+      </w:r>
+      <w:r>
+        <w:rPr>
+          <w:rStyle w:val="s1"/>
+          <w:iCs/>
+          <w:sz w:val="20"/>
+          <w:szCs w:val="20"/>
+        </w:rPr>
+        <w:t>u</w:t>
+      </w:r>
+      <w:r>
+        <w:rPr>
+          <w:rStyle w:val="s1"/>
+          <w:iCs/>
+          <w:sz w:val="20"/>
+          <w:szCs w:val="20"/>
+        </w:rPr>
+        <w:t>sing built-in MLflow judges, standard evaluation metrics, and custom-tailored scorers and custom metrics</w:t>
+      </w:r>
+      <w:r>
+        <w:rPr>
+          <w:rStyle w:val="s1"/>
+          <w:iCs/>
+          <w:sz w:val="20"/>
+          <w:szCs w:val="20"/>
+        </w:rPr>
+        <w:t xml:space="preserve"> – for details see the sample code </w:t>
+      </w:r>
+      <w:hyperlink r:id="rId8" w:history="1">
+        <w:r>
+          <w:rPr>
+            <w:rStyle w:val="Hyperlink"/>
+            <w:iCs/>
+            <w:sz w:val="20"/>
+            <w:szCs w:val="20"/>
+          </w:rPr>
+          <w:t>here</w:t>
+        </w:r>
+      </w:hyperlink>
+      <w:r>
+        <w:rPr>
+          <w:rStyle w:val="s1"/>
+          <w:iCs/>
           <w:sz w:val="20"/>
           <w:szCs w:val="20"/>
         </w:rPr>
@@ -497,148 +631,65 @@
           <w:sz w:val="20"/>
           <w:szCs w:val="20"/>
         </w:rPr>
-        <w:t xml:space="preserve">redesign </w:t>
-      </w:r>
-      <w:r>
-        <w:rPr>
-          <w:bCs/>
-          <w:sz w:val="20"/>
-          <w:szCs w:val="20"/>
-        </w:rPr>
-        <w:t xml:space="preserve">of </w:t>
-      </w:r>
-      <w:r>
-        <w:rPr>
-          <w:bCs/>
-          <w:sz w:val="20"/>
-          <w:szCs w:val="20"/>
-        </w:rPr>
-        <w:t>the online Fulfillment algorithm using</w:t>
-      </w:r>
-      <w:r>
-        <w:rPr>
-          <w:bCs/>
-          <w:sz w:val="20"/>
-          <w:szCs w:val="20"/>
-        </w:rPr>
-        <w:t xml:space="preserve"> the</w:t>
-      </w:r>
-      <w:r>
-        <w:rPr>
-          <w:bCs/>
-          <w:sz w:val="20"/>
-          <w:szCs w:val="20"/>
-        </w:rPr>
-        <w:t xml:space="preserve"> </w:t>
-      </w:r>
-      <m:oMath>
-        <m:r>
-          <w:rPr>
-            <w:rFonts w:ascii="Cambria Math" w:hAnsi="Cambria Math"/>
-            <w:sz w:val="20"/>
-            <w:szCs w:val="20"/>
-          </w:rPr>
-          <m:t>ε</m:t>
-        </m:r>
-      </m:oMath>
-      <w:r>
-        <w:rPr>
-          <w:bCs/>
-          <w:sz w:val="20"/>
-          <w:szCs w:val="20"/>
-        </w:rPr>
-        <w:t>-</w:t>
-      </w:r>
-      <w:r>
-        <w:rPr>
-          <w:bCs/>
-          <w:sz w:val="20"/>
-          <w:szCs w:val="20"/>
-        </w:rPr>
-        <w:t>constrain</w:t>
-      </w:r>
-      <w:r>
-        <w:rPr>
-          <w:bCs/>
-          <w:sz w:val="20"/>
-          <w:szCs w:val="20"/>
-        </w:rPr>
-        <w:t>t</w:t>
-      </w:r>
-      <w:r>
-        <w:rPr>
-          <w:bCs/>
-          <w:sz w:val="20"/>
-          <w:szCs w:val="20"/>
-        </w:rPr>
-        <w:t xml:space="preserve"> method</w:t>
-      </w:r>
-      <w:r>
-        <w:rPr>
-          <w:bCs/>
-          <w:sz w:val="20"/>
-          <w:szCs w:val="20"/>
-        </w:rPr>
-        <w:t xml:space="preserve">, </w:t>
-      </w:r>
-      <w:r>
-        <w:rPr>
-          <w:bCs/>
-          <w:sz w:val="20"/>
-          <w:szCs w:val="20"/>
-        </w:rPr>
-        <w:t>replac</w:t>
-      </w:r>
-      <w:r>
-        <w:rPr>
-          <w:bCs/>
-          <w:sz w:val="20"/>
-          <w:szCs w:val="20"/>
-        </w:rPr>
-        <w:t>ing</w:t>
-      </w:r>
-      <w:r>
-        <w:rPr>
-          <w:bCs/>
-          <w:sz w:val="20"/>
-          <w:szCs w:val="20"/>
-        </w:rPr>
-        <w:t xml:space="preserve"> the weighted objectives method for scalarization</w:t>
-      </w:r>
-      <w:r>
-        <w:rPr>
-          <w:bCs/>
-          <w:sz w:val="20"/>
-          <w:szCs w:val="20"/>
-        </w:rPr>
-        <w:t xml:space="preserve"> , reformulating the problem as Mixed Integer optimization problem.</w:t>
-      </w:r>
-      <w:r>
-        <w:rPr>
-          <w:bCs/>
-          <w:sz w:val="20"/>
-          <w:szCs w:val="20"/>
-        </w:rPr>
-        <w:t xml:space="preserve"> For details refer to </w:t>
-      </w:r>
-      <w:hyperlink r:id="rId8" w:history="1">
-        <w:r>
-          <w:rPr>
-            <w:rStyle w:val="Hyperlink"/>
-            <w:bCs/>
-            <w:sz w:val="20"/>
-            <w:szCs w:val="20"/>
-          </w:rPr>
-          <w:t>this document</w:t>
-        </w:r>
-      </w:hyperlink>
-      <w:r>
-        <w:rPr>
-          <w:bCs/>
-          <w:sz w:val="20"/>
-          <w:szCs w:val="20"/>
-        </w:rPr>
-        <w:t xml:space="preserve"> and </w:t>
+        <w:t>research various reinforcement learning Policy Gradient algorithms such as PPO, applying those to</w:t>
+      </w:r>
+      <w:r>
+        <w:rPr>
+          <w:bCs/>
+          <w:sz w:val="20"/>
+          <w:szCs w:val="20"/>
+        </w:rPr>
+        <w:t xml:space="preserve"> agentic workflows mentioned in a)</w:t>
+      </w:r>
+      <w:r>
+        <w:rPr>
+          <w:bCs/>
+          <w:sz w:val="20"/>
+          <w:szCs w:val="20"/>
+        </w:rPr>
+        <w:t xml:space="preserve">. For the purpose used the </w:t>
+      </w:r>
+      <w:r>
+        <w:rPr>
+          <w:rFonts w:ascii="Menlo" w:hAnsi="Menlo" w:cs="Menlo"/>
+          <w:bCs/>
+          <w:sz w:val="16"/>
+          <w:szCs w:val="16"/>
+        </w:rPr>
+        <w:t>gymnasium</w:t>
+      </w:r>
+      <w:r>
+        <w:rPr>
+          <w:bCs/>
+          <w:sz w:val="20"/>
+          <w:szCs w:val="20"/>
+        </w:rPr>
+        <w:t xml:space="preserve"> environment and </w:t>
+      </w:r>
+      <w:r>
+        <w:rPr>
+          <w:rFonts w:ascii="Menlo" w:hAnsi="Menlo" w:cs="Menlo"/>
+          <w:bCs/>
+          <w:sz w:val="16"/>
+          <w:szCs w:val="16"/>
+        </w:rPr>
+        <w:t>stable-baselines3</w:t>
+      </w:r>
+      <w:r>
+        <w:rPr>
+          <w:bCs/>
+          <w:sz w:val="20"/>
+          <w:szCs w:val="20"/>
+        </w:rPr>
+        <w:t xml:space="preserve"> library.</w:t>
+      </w:r>
+      <w:r>
+        <w:rPr>
+          <w:bCs/>
+          <w:sz w:val="20"/>
+          <w:szCs w:val="20"/>
+        </w:rPr>
+        <w:t xml:space="preserve"> Ongoing work captured in </w:t>
       </w:r>
       <w:hyperlink r:id="rId9" w:history="1">
         <w:r>
@@ -763,65 +814,167 @@
           <w:sz w:val="20"/>
           <w:szCs w:val="20"/>
         </w:rPr>
-        <w:t>research</w:t>
-      </w:r>
-      <w:r>
-        <w:rPr>
-          <w:bCs/>
-          <w:sz w:val="20"/>
-          <w:szCs w:val="20"/>
-        </w:rPr>
-        <w:t xml:space="preserve"> various reinforcement learning Policy Gradient algorithms such as PPO, applying those to Deployment Optimization and Fulfillment Optimization problems. For the purpose </w:t>
-      </w:r>
-      <w:r>
-        <w:rPr>
-          <w:bCs/>
-          <w:sz w:val="20"/>
-          <w:szCs w:val="20"/>
-        </w:rPr>
-        <w:t>used</w:t>
-      </w:r>
-      <w:r>
-        <w:rPr>
-          <w:bCs/>
-          <w:sz w:val="20"/>
-          <w:szCs w:val="20"/>
-        </w:rPr>
-        <w:t xml:space="preserve"> the </w:t>
-      </w:r>
-      <w:r>
-        <w:rPr>
-          <w:rFonts w:ascii="Menlo" w:hAnsi="Menlo" w:cs="Menlo"/>
-          <w:bCs/>
-          <w:sz w:val="16"/>
-          <w:szCs w:val="16"/>
-        </w:rPr>
-        <w:t>gymnasium</w:t>
-      </w:r>
-      <w:r>
-        <w:rPr>
-          <w:bCs/>
-          <w:sz w:val="20"/>
-          <w:szCs w:val="20"/>
-        </w:rPr>
-        <w:t xml:space="preserve"> environment and </w:t>
-      </w:r>
-      <w:r>
-        <w:rPr>
-          <w:rFonts w:ascii="Menlo" w:hAnsi="Menlo" w:cs="Menlo"/>
-          <w:bCs/>
-          <w:sz w:val="16"/>
-          <w:szCs w:val="16"/>
-        </w:rPr>
-        <w:t>stable-baselines3</w:t>
-      </w:r>
-      <w:r>
-        <w:rPr>
-          <w:bCs/>
-          <w:sz w:val="20"/>
-          <w:szCs w:val="20"/>
-        </w:rPr>
-        <w:t xml:space="preserve"> library.</w:t>
+        <w:t xml:space="preserve">redesign </w:t>
+      </w:r>
+      <w:r>
+        <w:rPr>
+          <w:bCs/>
+          <w:sz w:val="20"/>
+          <w:szCs w:val="20"/>
+        </w:rPr>
+        <w:t xml:space="preserve">of </w:t>
+      </w:r>
+      <w:r>
+        <w:rPr>
+          <w:bCs/>
+          <w:sz w:val="20"/>
+          <w:szCs w:val="20"/>
+        </w:rPr>
+        <w:t>the online Fulfillment algorithm using</w:t>
+      </w:r>
+      <w:r>
+        <w:rPr>
+          <w:bCs/>
+          <w:sz w:val="20"/>
+          <w:szCs w:val="20"/>
+        </w:rPr>
+        <w:t xml:space="preserve"> the</w:t>
+      </w:r>
+      <w:r>
+        <w:rPr>
+          <w:bCs/>
+          <w:sz w:val="20"/>
+          <w:szCs w:val="20"/>
+        </w:rPr>
+        <w:t xml:space="preserve"> </w:t>
+      </w:r>
+      <m:oMath>
+        <m:r>
+          <w:rPr>
+            <w:rFonts w:ascii="Cambria Math" w:hAnsi="Cambria Math"/>
+            <w:sz w:val="20"/>
+            <w:szCs w:val="20"/>
+          </w:rPr>
+          <m:t>ε</m:t>
+        </m:r>
+      </m:oMath>
+      <w:r>
+        <w:rPr>
+          <w:bCs/>
+          <w:sz w:val="20"/>
+          <w:szCs w:val="20"/>
+        </w:rPr>
+        <w:t>-</w:t>
+      </w:r>
+      <w:r>
+        <w:rPr>
+          <w:bCs/>
+          <w:sz w:val="20"/>
+          <w:szCs w:val="20"/>
+        </w:rPr>
+        <w:t>constrain</w:t>
+      </w:r>
+      <w:r>
+        <w:rPr>
+          <w:bCs/>
+          <w:sz w:val="20"/>
+          <w:szCs w:val="20"/>
+        </w:rPr>
+        <w:t>t</w:t>
+      </w:r>
+      <w:r>
+        <w:rPr>
+          <w:bCs/>
+          <w:sz w:val="20"/>
+          <w:szCs w:val="20"/>
+        </w:rPr>
+        <w:t xml:space="preserve"> method</w:t>
+      </w:r>
+      <w:r>
+        <w:rPr>
+          <w:bCs/>
+          <w:sz w:val="20"/>
+          <w:szCs w:val="20"/>
+        </w:rPr>
+        <w:t xml:space="preserve">, </w:t>
+      </w:r>
+      <w:r>
+        <w:rPr>
+          <w:bCs/>
+          <w:sz w:val="20"/>
+          <w:szCs w:val="20"/>
+        </w:rPr>
+        <w:t>replac</w:t>
+      </w:r>
+      <w:r>
+        <w:rPr>
+          <w:bCs/>
+          <w:sz w:val="20"/>
+          <w:szCs w:val="20"/>
+        </w:rPr>
+        <w:t>ing</w:t>
+      </w:r>
+      <w:r>
+        <w:rPr>
+          <w:bCs/>
+          <w:sz w:val="20"/>
+          <w:szCs w:val="20"/>
+        </w:rPr>
+        <w:t xml:space="preserve"> the weighted objectives method for scalarization</w:t>
+      </w:r>
+      <w:r>
+        <w:rPr>
+          <w:bCs/>
+          <w:sz w:val="20"/>
+          <w:szCs w:val="20"/>
+        </w:rPr>
+        <w:t xml:space="preserve"> , reformulating the problem as Mixed Integer optimization problem.</w:t>
+      </w:r>
+      <w:r>
+        <w:rPr>
+          <w:bCs/>
+          <w:sz w:val="20"/>
+          <w:szCs w:val="20"/>
+        </w:rPr>
+        <w:t xml:space="preserve"> For details refer to </w:t>
+      </w:r>
+      <w:hyperlink r:id="rId12" w:history="1">
+        <w:r>
+          <w:rPr>
+            <w:rStyle w:val="Hyperlink"/>
+            <w:bCs/>
+            <w:sz w:val="20"/>
+            <w:szCs w:val="20"/>
+          </w:rPr>
+          <w:t>this document</w:t>
+        </w:r>
+      </w:hyperlink>
+      <w:r>
+        <w:rPr>
+          <w:bCs/>
+          <w:sz w:val="20"/>
+          <w:szCs w:val="20"/>
+        </w:rPr>
+        <w:t xml:space="preserve"> and </w:t>
+      </w:r>
+      <w:hyperlink r:id="rId13" w:history="1">
+        <w:r>
+          <w:rPr>
+            <w:rStyle w:val="Hyperlink"/>
+            <w:bCs/>
+            <w:sz w:val="20"/>
+            <w:szCs w:val="20"/>
+          </w:rPr>
+          <w:t>this document</w:t>
+        </w:r>
+      </w:hyperlink>
+      <w:r>
+        <w:rPr>
+          <w:bCs/>
+          <w:sz w:val="20"/>
+          <w:szCs w:val="20"/>
+        </w:rPr>
+        <w:t>.</w:t>
       </w:r>
     </w:p>
     <w:p>
@@ -862,7 +1015,6 @@
         </w:rPr>
         <w:t xml:space="preserve">, </w:t>
       </w:r>
-      <w:proofErr w:type="spellStart"/>
       <w:r>
         <w:rPr>
           <w:rFonts w:ascii="Menlo" w:hAnsi="Menlo" w:cs="Menlo"/>
@@ -872,7 +1024,6 @@
         </w:rPr>
         <w:t>causalml</w:t>
       </w:r>
-      <w:proofErr w:type="spellEnd"/>
       <w:r>
         <w:rPr>
           <w:bCs/>
@@ -881,7 +1032,6 @@
         </w:rPr>
         <w:t xml:space="preserve"> and </w:t>
       </w:r>
-      <w:proofErr w:type="spellStart"/>
       <w:r>
         <w:rPr>
           <w:rFonts w:ascii="Menlo" w:hAnsi="Menlo" w:cs="Menlo"/>
@@ -891,7 +1041,6 @@
         </w:rPr>
         <w:t>dowhy</w:t>
       </w:r>
-      <w:proofErr w:type="spellEnd"/>
       <w:r>
         <w:rPr>
           <w:bCs/>
@@ -908,7 +1057,7 @@
         </w:rPr>
         <w:t xml:space="preserve"> For details refer to </w:t>
       </w:r>
-      <w:hyperlink r:id="rId12" w:history="1">
+      <w:hyperlink r:id="rId14" w:history="1">
         <w:r>
           <w:rPr>
             <w:rStyle w:val="Hyperlink"/>
@@ -927,7 +1076,7 @@
         </w:rPr>
         <w:t xml:space="preserve"> and </w:t>
       </w:r>
-      <w:hyperlink r:id="rId13" w:history="1">
+      <w:hyperlink r:id="rId15" w:history="1">
         <w:r>
           <w:rPr>
             <w:rStyle w:val="Hyperlink"/>
@@ -1100,7 +1249,7 @@
           <w:szCs w:val="20"/>
         </w:rPr>
       </w:pPr>
-      <w:hyperlink r:id="rId14" w:history="1">
+      <w:hyperlink r:id="rId16" w:history="1">
         <w:r>
           <w:rPr>
             <w:rStyle w:val="Hyperlink"/>
@@ -1204,7 +1353,7 @@
           <w:szCs w:val="20"/>
         </w:rPr>
       </w:pPr>
-      <w:hyperlink r:id="rId15" w:history="1">
+      <w:hyperlink r:id="rId17" w:history="1">
         <w:r>
           <w:rPr>
             <w:rStyle w:val="Hyperlink"/>
@@ -1263,7 +1412,7 @@
           <w:szCs w:val="20"/>
         </w:rPr>
       </w:pPr>
-      <w:hyperlink r:id="rId16" w:history="1">
+      <w:hyperlink r:id="rId18" w:history="1">
         <w:r>
           <w:rPr>
             <w:rStyle w:val="Hyperlink"/>
@@ -1287,7 +1436,7 @@
           <w:szCs w:val="20"/>
         </w:rPr>
       </w:pPr>
-      <w:hyperlink r:id="rId17" w:history="1">
+      <w:hyperlink r:id="rId19" w:history="1">
         <w:r>
           <w:rPr>
             <w:rStyle w:val="Hyperlink"/>
@@ -1311,7 +1460,7 @@
           <w:szCs w:val="20"/>
         </w:rPr>
       </w:pPr>
-      <w:hyperlink r:id="rId18" w:history="1">
+      <w:hyperlink r:id="rId20" w:history="1">
         <w:r>
           <w:rPr>
             <w:rStyle w:val="Hyperlink"/>
@@ -1335,7 +1484,7 @@
           <w:szCs w:val="20"/>
         </w:rPr>
       </w:pPr>
-      <w:hyperlink r:id="rId19" w:history="1">
+      <w:hyperlink r:id="rId21" w:history="1">
         <w:r>
           <w:rPr>
             <w:rStyle w:val="Hyperlink"/>
@@ -1359,7 +1508,7 @@
           <w:szCs w:val="20"/>
         </w:rPr>
       </w:pPr>
-      <w:hyperlink r:id="rId20" w:history="1">
+      <w:hyperlink r:id="rId22" w:history="1">
         <w:r>
           <w:rPr>
             <w:rStyle w:val="Hyperlink"/>
@@ -1440,7 +1589,7 @@
           <w:szCs w:val="20"/>
         </w:rPr>
       </w:pPr>
-      <w:hyperlink r:id="rId21" w:history="1">
+      <w:hyperlink r:id="rId23" w:history="1">
         <w:r>
           <w:rPr>
             <w:rStyle w:val="Hyperlink"/>
@@ -1465,7 +1614,7 @@
           <w:u w:val="single"/>
         </w:rPr>
       </w:pPr>
-      <w:hyperlink r:id="rId22" w:history="1">
+      <w:hyperlink r:id="rId24" w:history="1">
         <w:r>
           <w:rPr>
             <w:rStyle w:val="Hyperlink"/>
@@ -1489,7 +1638,7 @@
           <w:szCs w:val="20"/>
         </w:rPr>
       </w:pPr>
-      <w:hyperlink r:id="rId23" w:history="1">
+      <w:hyperlink r:id="rId25" w:history="1">
         <w:r>
           <w:rPr>
             <w:rStyle w:val="Hyperlink"/>
@@ -1513,7 +1662,7 @@
           <w:szCs w:val="20"/>
         </w:rPr>
       </w:pPr>
-      <w:hyperlink r:id="rId24" w:history="1">
+      <w:hyperlink r:id="rId26" w:history="1">
         <w:r>
           <w:rPr>
             <w:rStyle w:val="Hyperlink"/>
@@ -1572,7 +1721,7 @@
           <w:szCs w:val="20"/>
         </w:rPr>
       </w:pPr>
-      <w:hyperlink r:id="rId25" w:history="1">
+      <w:hyperlink r:id="rId27" w:history="1">
         <w:r>
           <w:rPr>
             <w:rStyle w:val="Hyperlink"/>
@@ -1596,7 +1745,7 @@
           <w:szCs w:val="20"/>
         </w:rPr>
       </w:pPr>
-      <w:hyperlink r:id="rId26" w:history="1">
+      <w:hyperlink r:id="rId28" w:history="1">
         <w:r>
           <w:rPr>
             <w:rStyle w:val="Hyperlink"/>
@@ -1620,7 +1769,7 @@
           <w:szCs w:val="20"/>
         </w:rPr>
       </w:pPr>
-      <w:hyperlink r:id="rId27" w:history="1">
+      <w:hyperlink r:id="rId29" w:history="1">
         <w:r>
           <w:rPr>
             <w:rStyle w:val="Hyperlink"/>
@@ -1642,7 +1791,7 @@
           <w:u w:val="single"/>
         </w:rPr>
       </w:pPr>
-      <w:hyperlink r:id="rId28" w:history="1">
+      <w:hyperlink r:id="rId30" w:history="1">
         <w:r>
           <w:rPr>
             <w:rStyle w:val="Hyperlink"/>
@@ -2229,6 +2378,11 @@
       <w:contextualSpacing/>
     </w:pPr>
   </w:style>
+  <w:style w:type="character" w:customStyle="1" w:styleId="s1">
+    <w:name w:val="s1"/>
+    <w:basedOn w:val="DefaultParagraphFont"/>
+    <w:rsid w:val="002261B3"/>
+  </w:style>
 </w:styles>
 </file>
 

</xml_diff>

<commit_message>
Update Letter of Intent and Prev Work
</commit_message>
<xml_diff>
--- a/LetterOfIntentAndPreviousWork.docx
+++ b/LetterOfIntentAndPreviousWork.docx
@@ -547,7 +547,6 @@
         <w:t xml:space="preserve">valuation of these workflows using built-in MLflow judges, standard evaluation metrics, and custom-tailored scorers and custom metrics – for details see the sample code </w:t>
       </w:r>
       <w:hyperlink r:id="rId8" w:history="1">
-        <w:proofErr w:type="spellStart"/>
         <w:r>
           <w:rPr>
             <w:rStyle w:val="Hyperlink"/>
@@ -567,7 +566,6 @@
         </w:rPr>
         <w:t>.</w:t>
       </w:r>
-      <w:proofErr w:type="spellEnd"/>
     </w:p>
     <w:p>
       <w:pPr>
@@ -590,25 +588,7 @@
           <w:sz w:val="20"/>
           <w:szCs w:val="20"/>
         </w:rPr>
-        <w:t>C</w:t>
-      </w:r>
-      <w:r>
-        <w:rPr>
-          <w:rFonts w:eastAsia="Times New Roman" w:cstheme="minorHAnsi"/>
-          <w:color w:val="000000"/>
-          <w:sz w:val="20"/>
-          <w:szCs w:val="20"/>
-        </w:rPr>
-        <w:t>onservative-by-construction language models and the shared-potential separator</w:t>
-      </w:r>
-      <w:r>
-        <w:rPr>
-          <w:rFonts w:eastAsia="Times New Roman" w:cstheme="minorHAnsi"/>
-          <w:color w:val="000000"/>
-          <w:sz w:val="20"/>
-          <w:szCs w:val="20"/>
-        </w:rPr>
-        <w:t xml:space="preserve"> </w:t>
+        <w:t xml:space="preserve">Conservative-by-construction language models and the shared-potential separator </w:t>
       </w:r>
       <w:r>
         <w:rPr>

</xml_diff>